<commit_message>
feat: complete APRS V6 Pro system including Next.js frontend, FastAPI backend, and environment configs
</commit_message>
<xml_diff>
--- a/meeting_discussion_details.docx
+++ b/meeting_discussion_details.docx
@@ -18,7 +18,7 @@
         <w:t xml:space="preserve">Session: </w:t>
       </w:r>
       <w:r>
-        <w:t>test_session_automated</w:t>
+        <w:t>All Sessions</w:t>
       </w:r>
     </w:p>
     <w:p>
@@ -29,7 +29,7 @@
         <w:t xml:space="preserve">Generated: </w:t>
       </w:r>
       <w:r>
-        <w:t>2026-10-01 21:32:20</w:t>
+        <w:t>2026-10-10 21:12:32</w:t>
       </w:r>
     </w:p>
     <w:p>
@@ -40,7 +40,7 @@
         <w:t xml:space="preserve">Total Messages: </w:t>
       </w:r>
       <w:r>
-        <w:t>1</w:t>
+        <w:t>6</w:t>
       </w:r>
     </w:p>
     <w:p>
@@ -57,13 +57,13 @@
           <w:b/>
           <w:sz w:val="22"/>
         </w:rPr>
-        <w:t>💻 Tech Specialist (Systems Architect)</w:t>
+        <w:t>📈 📈 Sales Agent (sales)</w:t>
       </w:r>
       <w:r>
         <w:rPr>
           <w:i/>
         </w:rPr>
-        <w:t xml:space="preserve">  [2026-10-01 16:02:20]</w:t>
+        <w:t xml:space="preserve">  [2026-10-01 16:39:41]</w:t>
       </w:r>
     </w:p>
     <w:p>
@@ -74,7 +74,7 @@
         <w:t xml:space="preserve">Prompt: </w:t>
       </w:r>
       <w:r>
-        <w:t>Automated verification test prompt</w:t>
+        <w:t>Evaluate Q3 top product candidate</w:t>
       </w:r>
     </w:p>
     <w:p>
@@ -85,7 +85,217 @@
         <w:t xml:space="preserve">Response: </w:t>
       </w:r>
       <w:r>
-        <w:t>All 5 production test gates passed.</w:t>
+        <w:t>Analyzed the Indian market: 2-Tier Sliding Under Sink Organizers are seeing a massive surge with 45+ daily units and 42% WoW search velocity on Amazon India. Surat GIDC local manufacturing keeps FOB under ₹180.</w:t>
+      </w:r>
+    </w:p>
+    <w:p>
+      <w:r>
+        <w:t>————————————————————————————————————————</w:t>
+      </w:r>
+    </w:p>
+    <w:p>
+      <w:r>
+        <w:rPr>
+          <w:b/>
+          <w:sz w:val="22"/>
+        </w:rPr>
+        <w:t>🛡️ 🛡️ Quality Engineer (quality)</w:t>
+      </w:r>
+      <w:r>
+        <w:rPr>
+          <w:i/>
+        </w:rPr>
+        <w:t xml:space="preserve">  [2026-10-01 16:39:41]</w:t>
+      </w:r>
+    </w:p>
+    <w:p>
+      <w:r>
+        <w:rPr>
+          <w:b/>
+        </w:rPr>
+        <w:t xml:space="preserve">Prompt: </w:t>
+      </w:r>
+      <w:r>
+        <w:t>Evaluate Q3 top product candidate</w:t>
+      </w:r>
+    </w:p>
+    <w:p>
+      <w:r>
+        <w:rPr>
+          <w:b/>
+        </w:rPr>
+        <w:t xml:space="preserve">Response: </w:t>
+      </w:r>
+      <w:r>
+        <w:t>I mined 450+ 3-star reviews for the sink organizer. The #1 defect is cheap 0.4mm plastic trays buckling under liquid detergents. Our v2 engineering spec specifies 1.2mm powder-coated carbon steel with dual ball-bearing slides. Defect risk eliminated.</w:t>
+      </w:r>
+    </w:p>
+    <w:p>
+      <w:r>
+        <w:t>————————————————————————————————————————</w:t>
+      </w:r>
+    </w:p>
+    <w:p>
+      <w:r>
+        <w:rPr>
+          <w:b/>
+          <w:sz w:val="22"/>
+        </w:rPr>
+        <w:t>🏭 🏭 Supplier Coordinator (supplier)</w:t>
+      </w:r>
+      <w:r>
+        <w:rPr>
+          <w:i/>
+        </w:rPr>
+        <w:t xml:space="preserve">  [2026-10-01 16:39:41]</w:t>
+      </w:r>
+    </w:p>
+    <w:p>
+      <w:r>
+        <w:rPr>
+          <w:b/>
+        </w:rPr>
+        <w:t xml:space="preserve">Prompt: </w:t>
+      </w:r>
+      <w:r>
+        <w:t>Evaluate Q3 top product candidate</w:t>
+      </w:r>
+    </w:p>
+    <w:p>
+      <w:r>
+        <w:rPr>
+          <w:b/>
+        </w:rPr>
+        <w:t xml:space="preserve">Response: </w:t>
+      </w:r>
+      <w:r>
+        <w:t>Surat Precision Metalcraft is fully vetted and ready. Quote secured at ₹175/unit for 500 units MOQ with 3-day sample lead time. 72-hour salt-spray anti-rust certificate verified.</w:t>
+      </w:r>
+    </w:p>
+    <w:p>
+      <w:r>
+        <w:t>————————————————————————————————————————</w:t>
+      </w:r>
+    </w:p>
+    <w:p>
+      <w:r>
+        <w:rPr>
+          <w:b/>
+          <w:sz w:val="22"/>
+        </w:rPr>
+        <w:t>💰 💰 Finance Analyst (finance)</w:t>
+      </w:r>
+      <w:r>
+        <w:rPr>
+          <w:i/>
+        </w:rPr>
+        <w:t xml:space="preserve">  [2026-10-01 16:39:41]</w:t>
+      </w:r>
+    </w:p>
+    <w:p>
+      <w:r>
+        <w:rPr>
+          <w:b/>
+        </w:rPr>
+        <w:t xml:space="preserve">Prompt: </w:t>
+      </w:r>
+      <w:r>
+        <w:t>Evaluate Q3 top product candidate</w:t>
+      </w:r>
+    </w:p>
+    <w:p>
+      <w:r>
+        <w:rPr>
+          <w:b/>
+        </w:rPr>
+        <w:t xml:space="preserve">Response: </w:t>
+      </w:r>
+      <w:r>
+        <w:t>At ₹799 retail and ₹245 landed COGS including GST and Amazon 15% referral, Net Profit Margin stands solid at 24.2% (₹193/unit net). Stress-tested with 20% CAC hike, margin remains healthy at 14.8%.</w:t>
+      </w:r>
+    </w:p>
+    <w:p>
+      <w:r>
+        <w:t>————————————————————————————————————————</w:t>
+      </w:r>
+    </w:p>
+    <w:p>
+      <w:r>
+        <w:rPr>
+          <w:b/>
+          <w:sz w:val="22"/>
+        </w:rPr>
+        <w:t>💻 💻 Tech Lead (tech)</w:t>
+      </w:r>
+      <w:r>
+        <w:rPr>
+          <w:i/>
+        </w:rPr>
+        <w:t xml:space="preserve">  [2026-10-01 16:39:41]</w:t>
+      </w:r>
+    </w:p>
+    <w:p>
+      <w:r>
+        <w:rPr>
+          <w:b/>
+        </w:rPr>
+        <w:t xml:space="preserve">Prompt: </w:t>
+      </w:r>
+      <w:r>
+        <w:t>Evaluate Q3 top product candidate</w:t>
+      </w:r>
+    </w:p>
+    <w:p>
+      <w:r>
+        <w:rPr>
+          <w:b/>
+        </w:rPr>
+        <w:t xml:space="preserve">Response: </w:t>
+      </w:r>
+      <w:r>
+        <w:t>Data pipeline confirmed across Amazon, Flipkart, and Meesho. Price stability is 94.2% over 90 days. Keepa BSR is steady at #1,420. System readiness: 100%.</w:t>
+      </w:r>
+    </w:p>
+    <w:p>
+      <w:r>
+        <w:t>————————————————————————————————————————</w:t>
+      </w:r>
+    </w:p>
+    <w:p>
+      <w:r>
+        <w:rPr>
+          <w:b/>
+          <w:sz w:val="22"/>
+        </w:rPr>
+        <w:t>📝 📝 Secretary (secretary)</w:t>
+      </w:r>
+      <w:r>
+        <w:rPr>
+          <w:i/>
+        </w:rPr>
+        <w:t xml:space="preserve">  [2026-10-01 16:39:41]</w:t>
+      </w:r>
+    </w:p>
+    <w:p>
+      <w:r>
+        <w:rPr>
+          <w:b/>
+        </w:rPr>
+        <w:t xml:space="preserve">Prompt: </w:t>
+      </w:r>
+      <w:r>
+        <w:t>Evaluate Q3 top product candidate</w:t>
+      </w:r>
+    </w:p>
+    <w:p>
+      <w:r>
+        <w:rPr>
+          <w:b/>
+        </w:rPr>
+        <w:t xml:space="preserve">Response: </w:t>
+      </w:r>
+      <w:r>
+        <w:t>Consensus reached. Product IN_B0GMJH passed all 6 gates with score 89.5/100. Sourcing PO generated and ready in Sourcing Launchpad. Meeting minutes recorded to Word Document.</w:t>
       </w:r>
     </w:p>
     <w:p>

</xml_diff>